<commit_message>
few fixes in docx export
few fixes in docx export
</commit_message>
<xml_diff>
--- a/src/tenant_template.docx
+++ b/src/tenant_template.docx
@@ -389,37 +389,169 @@
         </w:rPr>
         <w:t xml:space="preserve"> side of the building with meter number </w:t>
       </w:r>
+      <w:proofErr w:type="gramStart"/>
       <w:r>
         <w:rPr>
           <w:rFonts w:ascii="Aptos" w:hAnsi="Aptos" w:cs="Aptos Serif"/>
           <w:b/>
           <w:bCs/>
         </w:rPr>
-        <w:t>{</w:t>
-      </w:r>
-      <w:proofErr w:type="spellStart"/>
+        <w:t xml:space="preserve">“ </w:t>
+      </w:r>
       <w:r>
         <w:rPr>
           <w:rFonts w:ascii="Aptos" w:hAnsi="Aptos" w:cs="Aptos Serif"/>
           <w:b/>
           <w:bCs/>
         </w:rPr>
-        <w:t>meter_number</w:t>
-      </w:r>
-      <w:proofErr w:type="spellEnd"/>
+        <w:t>{</w:t>
+      </w:r>
+      <w:proofErr w:type="spellStart"/>
+      <w:proofErr w:type="gramEnd"/>
       <w:r>
         <w:rPr>
           <w:rFonts w:ascii="Aptos" w:hAnsi="Aptos" w:cs="Aptos Serif"/>
           <w:b/>
           <w:bCs/>
         </w:rPr>
+        <w:t>meter_number</w:t>
+      </w:r>
+      <w:proofErr w:type="spellEnd"/>
+      <w:r>
+        <w:rPr>
+          <w:rFonts w:ascii="Aptos" w:hAnsi="Aptos" w:cs="Aptos Serif"/>
+          <w:b/>
+          <w:bCs/>
+        </w:rPr>
         <w:t>}</w:t>
       </w:r>
       <w:r>
         <w:rPr>
           <w:rFonts w:ascii="Aptos" w:hAnsi="Aptos" w:cs="Aptos Serif"/>
-        </w:rPr>
-        <w:t xml:space="preserve">, situated at </w:t>
+          <w:b/>
+          <w:bCs/>
+        </w:rPr>
+        <w:t xml:space="preserve"> </w:t>
+      </w:r>
+      <w:proofErr w:type="gramStart"/>
+      <w:r>
+        <w:rPr>
+          <w:rFonts w:ascii="Aptos" w:hAnsi="Aptos" w:cs="Aptos Serif"/>
+          <w:b/>
+          <w:bCs/>
+        </w:rPr>
+        <w:t>“</w:t>
+      </w:r>
+      <w:r>
+        <w:rPr>
+          <w:rFonts w:ascii="Aptos" w:hAnsi="Aptos" w:cs="Aptos Serif"/>
+          <w:b/>
+          <w:bCs/>
+        </w:rPr>
+        <w:t xml:space="preserve"> </w:t>
+      </w:r>
+      <w:r>
+        <w:rPr>
+          <w:rFonts w:ascii="Aptos" w:hAnsi="Aptos" w:cs="Aptos Serif"/>
+        </w:rPr>
+        <w:t>and</w:t>
+      </w:r>
+      <w:proofErr w:type="gramEnd"/>
+      <w:r>
+        <w:rPr>
+          <w:rFonts w:ascii="Aptos" w:hAnsi="Aptos" w:cs="Aptos Serif"/>
+        </w:rPr>
+        <w:t xml:space="preserve"> </w:t>
+      </w:r>
+      <w:r>
+        <w:rPr>
+          <w:rFonts w:ascii="Aptos" w:hAnsi="Aptos" w:cs="Aptos Serif"/>
+        </w:rPr>
+        <w:t>u</w:t>
+      </w:r>
+      <w:r>
+        <w:rPr>
+          <w:rFonts w:ascii="Aptos" w:hAnsi="Aptos" w:cs="Aptos Serif"/>
+        </w:rPr>
+        <w:t xml:space="preserve">nit </w:t>
+      </w:r>
+      <w:r>
+        <w:rPr>
+          <w:rFonts w:ascii="Aptos" w:hAnsi="Aptos" w:cs="Aptos Serif"/>
+        </w:rPr>
+        <w:t>n</w:t>
+      </w:r>
+      <w:r>
+        <w:rPr>
+          <w:rFonts w:ascii="Aptos" w:hAnsi="Aptos" w:cs="Aptos Serif"/>
+        </w:rPr>
+        <w:t xml:space="preserve">ame </w:t>
+      </w:r>
+      <w:proofErr w:type="gramStart"/>
+      <w:r>
+        <w:rPr>
+          <w:rFonts w:ascii="Aptos" w:hAnsi="Aptos" w:cs="Aptos Serif"/>
+          <w:b/>
+          <w:bCs/>
+        </w:rPr>
+        <w:t>“</w:t>
+      </w:r>
+      <w:r>
+        <w:rPr>
+          <w:rFonts w:ascii="Aptos" w:hAnsi="Aptos" w:cs="Aptos Serif"/>
+          <w:b/>
+          <w:bCs/>
+        </w:rPr>
+        <w:t xml:space="preserve"> </w:t>
+      </w:r>
+      <w:r>
+        <w:rPr>
+          <w:rFonts w:ascii="Aptos" w:hAnsi="Aptos" w:cs="Aptos Serif"/>
+          <w:b/>
+          <w:bCs/>
+        </w:rPr>
+        <w:t>{</w:t>
+      </w:r>
+      <w:proofErr w:type="spellStart"/>
+      <w:proofErr w:type="gramEnd"/>
+      <w:r>
+        <w:rPr>
+          <w:rFonts w:ascii="Aptos" w:hAnsi="Aptos" w:cs="Aptos Serif"/>
+          <w:b/>
+          <w:bCs/>
+        </w:rPr>
+        <w:t>unit_name</w:t>
+      </w:r>
+      <w:proofErr w:type="spellEnd"/>
+      <w:r>
+        <w:rPr>
+          <w:rFonts w:ascii="Aptos" w:hAnsi="Aptos" w:cs="Aptos Serif"/>
+          <w:b/>
+          <w:bCs/>
+        </w:rPr>
+        <w:t>}</w:t>
+      </w:r>
+      <w:r>
+        <w:rPr>
+          <w:rFonts w:ascii="Aptos" w:hAnsi="Aptos" w:cs="Aptos Serif"/>
+          <w:b/>
+          <w:bCs/>
+        </w:rPr>
+        <w:t xml:space="preserve"> “</w:t>
+      </w:r>
+      <w:r>
+        <w:rPr>
+          <w:rFonts w:ascii="Aptos" w:hAnsi="Aptos" w:cs="Aptos Serif"/>
+          <w:b/>
+          <w:bCs/>
+        </w:rPr>
+        <w:t xml:space="preserve">, </w:t>
+      </w:r>
+      <w:r>
+        <w:rPr>
+          <w:rFonts w:ascii="Aptos" w:hAnsi="Aptos" w:cs="Aptos Serif"/>
+        </w:rPr>
+        <w:t xml:space="preserve">situated at </w:t>
       </w:r>
       <w:r>
         <w:rPr>
@@ -522,34 +654,62 @@
           <w:b/>
           <w:bCs/>
         </w:rPr>
-        <w:t>rent_amount</w:t>
-      </w:r>
-      <w:proofErr w:type="spellEnd"/>
+        <w:t>rent_</w:t>
+      </w:r>
+      <w:proofErr w:type="gramStart"/>
       <w:r>
         <w:rPr>
           <w:rFonts w:ascii="Aptos" w:hAnsi="Aptos" w:cs="Aptos Serif"/>
           <w:b/>
           <w:bCs/>
         </w:rPr>
-        <w:t>}/- ({</w:t>
-      </w:r>
-      <w:proofErr w:type="spellStart"/>
+        <w:t>amount</w:t>
+      </w:r>
+      <w:proofErr w:type="spellEnd"/>
       <w:r>
         <w:rPr>
           <w:rFonts w:ascii="Aptos" w:hAnsi="Aptos" w:cs="Aptos Serif"/>
           <w:b/>
           <w:bCs/>
         </w:rPr>
-        <w:t>rent_amount_words</w:t>
-      </w:r>
-      <w:proofErr w:type="spellEnd"/>
+        <w:t>}/- ({</w:t>
+      </w:r>
+      <w:proofErr w:type="spellStart"/>
+      <w:proofErr w:type="gramEnd"/>
       <w:r>
         <w:rPr>
           <w:rFonts w:ascii="Aptos" w:hAnsi="Aptos" w:cs="Aptos Serif"/>
           <w:b/>
           <w:bCs/>
         </w:rPr>
-        <w:t>}),</w:t>
+        <w:t>rent_amount_</w:t>
+      </w:r>
+      <w:proofErr w:type="gramStart"/>
+      <w:r>
+        <w:rPr>
+          <w:rFonts w:ascii="Aptos" w:hAnsi="Aptos" w:cs="Aptos Serif"/>
+          <w:b/>
+          <w:bCs/>
+        </w:rPr>
+        <w:t>words</w:t>
+      </w:r>
+      <w:proofErr w:type="spellEnd"/>
+      <w:r>
+        <w:rPr>
+          <w:rFonts w:ascii="Aptos" w:hAnsi="Aptos" w:cs="Aptos Serif"/>
+          <w:b/>
+          <w:bCs/>
+        </w:rPr>
+        <w:t>})</w:t>
+      </w:r>
+      <w:proofErr w:type="gramEnd"/>
+      <w:r>
+        <w:rPr>
+          <w:rFonts w:ascii="Aptos" w:hAnsi="Aptos" w:cs="Aptos Serif"/>
+          <w:b/>
+          <w:bCs/>
+        </w:rPr>
+        <w:t>,</w:t>
       </w:r>
       <w:r>
         <w:rPr>
@@ -942,6 +1102,7 @@
       <w:r>
         <w:t xml:space="preserve"> and shall </w:t>
       </w:r>
+      <w:proofErr w:type="gramStart"/>
       <w:r>
         <w:t>continue</w:t>
       </w:r>
@@ -949,7 +1110,11 @@
         <w:t xml:space="preserve"> </w:t>
       </w:r>
       <w:r>
-        <w:t xml:space="preserve">on </w:t>
+        <w:t>on</w:t>
+      </w:r>
+      <w:proofErr w:type="gramEnd"/>
+      <w:r>
+        <w:t xml:space="preserve"> </w:t>
       </w:r>
       <w:r>
         <w:t>a month-to-month basis, unless terminated earlier in accordance with the terms of this Agreement.</w:t>
@@ -1587,7 +1752,21 @@
               <w:rPr>
                 <w:rFonts w:ascii="Aptos" w:hAnsi="Aptos" w:cs="Aptos Serif"/>
               </w:rPr>
-              <w:t>{#family}{name}</w:t>
+              <w:t>{#</w:t>
+            </w:r>
+            <w:proofErr w:type="gramStart"/>
+            <w:r>
+              <w:rPr>
+                <w:rFonts w:ascii="Aptos" w:hAnsi="Aptos" w:cs="Aptos Serif"/>
+              </w:rPr>
+              <w:t>family}{</w:t>
+            </w:r>
+            <w:proofErr w:type="gramEnd"/>
+            <w:r>
+              <w:rPr>
+                <w:rFonts w:ascii="Aptos" w:hAnsi="Aptos" w:cs="Aptos Serif"/>
+              </w:rPr>
+              <w:t>name}</w:t>
             </w:r>
           </w:p>
         </w:tc>
@@ -1691,11 +1870,19 @@
                 <w:rFonts w:ascii="Aptos" w:hAnsi="Aptos" w:cs="Aptos Serif"/>
               </w:rPr>
             </w:pPr>
+            <w:proofErr w:type="gramStart"/>
             <w:r>
               <w:rPr>
                 <w:rFonts w:ascii="Aptos" w:hAnsi="Aptos" w:cs="Aptos Serif"/>
               </w:rPr>
-              <w:t>{address}{/family}</w:t>
+              <w:t>{address}{/</w:t>
+            </w:r>
+            <w:proofErr w:type="gramEnd"/>
+            <w:r>
+              <w:rPr>
+                <w:rFonts w:ascii="Aptos" w:hAnsi="Aptos" w:cs="Aptos Serif"/>
+              </w:rPr>
+              <w:t>family}</w:t>
             </w:r>
           </w:p>
         </w:tc>
@@ -1929,9 +2116,19 @@
           <w:b/>
           <w:bCs/>
         </w:rPr>
-        <w:t>Pet Policy: {</w:t>
+        <w:t xml:space="preserve">Pet </w:t>
+      </w:r>
+      <w:proofErr w:type="gramStart"/>
+      <w:r>
+        <w:rPr>
+          <w:rFonts w:ascii="Aptos" w:hAnsi="Aptos" w:cs="Aptos Serif"/>
+          <w:b/>
+          <w:bCs/>
+        </w:rPr>
+        <w:t>Policy: {</w:t>
       </w:r>
       <w:proofErr w:type="spellStart"/>
+      <w:proofErr w:type="gramEnd"/>
       <w:r>
         <w:rPr>
           <w:rFonts w:ascii="Aptos" w:hAnsi="Aptos" w:cs="Aptos Serif"/>
@@ -1994,7 +2191,21 @@
         <w:rPr>
           <w:rFonts w:ascii="Aptos" w:hAnsi="Aptos" w:cs="Aptos Serif"/>
         </w:rPr>
-        <w:t>, subject to normal wear and tear. Any damage beyond normal wear and tear shall be assessed and adjusted against the security deposit, and any shortfall shall be payable by the Tenant.</w:t>
+        <w:t xml:space="preserve">, subject to normal wear and tear. Any damage beyond normal wear and </w:t>
+      </w:r>
+      <w:proofErr w:type="gramStart"/>
+      <w:r>
+        <w:rPr>
+          <w:rFonts w:ascii="Aptos" w:hAnsi="Aptos" w:cs="Aptos Serif"/>
+        </w:rPr>
+        <w:t>tear</w:t>
+      </w:r>
+      <w:proofErr w:type="gramEnd"/>
+      <w:r>
+        <w:rPr>
+          <w:rFonts w:ascii="Aptos" w:hAnsi="Aptos" w:cs="Aptos Serif"/>
+        </w:rPr>
+        <w:t xml:space="preserve"> shall be assessed and adjusted against the security deposit, and any shortfall shall be payable by the Tenant.</w:t>
       </w:r>
     </w:p>
     <w:p>
@@ -3817,7 +4028,6 @@
   <w:style w:type="character" w:default="1" w:styleId="DefaultParagraphFont">
     <w:name w:val="Default Paragraph Font"/>
     <w:uiPriority w:val="1"/>
-    <w:semiHidden/>
     <w:unhideWhenUsed/>
   </w:style>
   <w:style w:type="table" w:default="1" w:styleId="TableNormal">

</xml_diff>